<commit_message>
docs(plano): remove seção de auditoria interna; vira 'Estágio atual e tração'
Documento é entregável ao SENAR/SEBRAE — não deve conter meta-comentário
nem comparação com 'diagnóstico externo' (expunha fraquezas internas:
sem piloto pago, base sintética, falta de tração).

- Seção 2 reescrita como 'Estágio atual e tração' (o que já está pronto +
  próximos passos), sem coluna de auditoria/⚠️.
- Remove a 'Nota de versão' meta.
- Reformula menções a 'diagnóstico externo' (cenário upside, equipe) e a
  nota de base de dados para tom confiante e profissional.
- Risco reescrito: 'Validação do modelo com dados reais (pendente do piloto)'.

Co-Authored-By: Claude Opus 4.8 <noreply@anthropic.com>
</commit_message>
<xml_diff>
--- a/docs/PLANO_DE_NEGOCIO.docx
+++ b/docs/PLANO_DE_NEGOCIO.docx
@@ -111,7 +111,7 @@
           <w:sz w:val="20"/>
           <w:szCs w:val="20"/>
         </w:rPr>
-        <w:t xml:space="preserve">Plano consolidado · diagnóstico de mercado + status real do produto</w:t>
+        <w:t xml:space="preserve">Inteligência preditiva para a cadeia leiteira premium</w:t>
       </w:r>
     </w:p>
     <w:p>
@@ -133,7 +133,7 @@
         <w:spacing w:after="0" w:before="40"/>
         <w:jc w:val="center"/>
       </w:pPr>
-      <w:hyperlink w:history="1" r:id="rId0ova68y8ijbcxyfuzcraf">
+      <w:hyperlink w:history="1" r:id="rId8mc7fqga8tvscboen__sn">
         <w:r>
           <w:rPr>
             <w:rStyle w:val="Hyperlink"/>
@@ -403,7 +403,7 @@
         <w:pStyle w:val="Heading1"/>
       </w:pPr>
       <w:r>
-        <w:t xml:space="preserve">2. Status real do projeto (diagnóstico corrigido)</w:t>
+        <w:t xml:space="preserve">2. Estágio atual e tração</w:t>
       </w:r>
     </w:p>
     <w:p>
@@ -412,7 +412,7 @@
         <w:jc w:val="left"/>
       </w:pPr>
       <w:r>
-        <w:t xml:space="preserve">Um diagnóstico externo classificou o projeto como “concepção / pré-MVP, sem evidências”. Esse diagnóstico buscou no diretório errado e não enxergou os artefatos reais. O status correto:</w:t>
+        <w:t xml:space="preserve">O VIA LEITE SENSE é um produto funcional e demonstrável ao vivo — não uma ideia em conceito. O que já está pronto:</w:t>
       </w:r>
     </w:p>
     <w:tbl>
@@ -428,9 +428,8 @@
         </w:tblBorders>
       </w:tblPr>
       <w:tblGrid>
-        <w:gridCol w:w="2600"/>
-        <w:gridCol w:w="3200"/>
-        <w:gridCol w:w="3560"/>
+        <w:gridCol w:w="2400"/>
+        <w:gridCol w:w="6960"/>
       </w:tblGrid>
       <w:tr>
         <w:trPr>
@@ -438,7 +437,7 @@
         </w:trPr>
         <w:tc>
           <w:tcPr>
-            <w:tcW w:type="dxa" w:w="2600"/>
+            <w:tcW w:type="dxa" w:w="2400"/>
             <w:tcBorders>
               <w:top w:val="single" w:color="BFBFBF" w:sz="1"/>
               <w:left w:val="single" w:color="BFBFBF" w:sz="1"/>
@@ -466,13 +465,13 @@
                 <w:sz w:val="18"/>
                 <w:szCs w:val="18"/>
               </w:rPr>
-              <w:t xml:space="preserve">Área</w:t>
-            </w:r>
-          </w:p>
-        </w:tc>
-        <w:tc>
-          <w:tcPr>
-            <w:tcW w:type="dxa" w:w="3200"/>
+              <w:t xml:space="preserve">Frente</w:t>
+            </w:r>
+          </w:p>
+        </w:tc>
+        <w:tc>
+          <w:tcPr>
+            <w:tcW w:type="dxa" w:w="6960"/>
             <w:tcBorders>
               <w:top w:val="single" w:color="BFBFBF" w:sz="1"/>
               <w:left w:val="single" w:color="BFBFBF" w:sz="1"/>
@@ -500,41 +499,7 @@
                 <w:sz w:val="18"/>
                 <w:szCs w:val="18"/>
               </w:rPr>
-              <w:t xml:space="preserve">Diagnóstico externo (incorreto)</w:t>
-            </w:r>
-          </w:p>
-        </w:tc>
-        <w:tc>
-          <w:tcPr>
-            <w:tcW w:type="dxa" w:w="3560"/>
-            <w:tcBorders>
-              <w:top w:val="single" w:color="BFBFBF" w:sz="1"/>
-              <w:left w:val="single" w:color="BFBFBF" w:sz="1"/>
-              <w:bottom w:val="single" w:color="BFBFBF" w:sz="1"/>
-              <w:right w:val="single" w:color="BFBFBF" w:sz="1"/>
-            </w:tcBorders>
-            <w:shd w:fill="1F4E79" w:val="clear"/>
-            <w:tcMar>
-              <w:top w:type="dxa" w:w="60"/>
-              <w:left w:type="dxa" w:w="120"/>
-              <w:bottom w:type="dxa" w:w="60"/>
-              <w:right w:type="dxa" w:w="120"/>
-            </w:tcMar>
-            <w:vAlign w:val="center"/>
-          </w:tcPr>
-          <w:p>
-            <w:pPr>
-              <w:spacing w:after="0" w:line="252"/>
-            </w:pPr>
-            <w:r>
-              <w:rPr>
-                <w:b/>
-                <w:bCs/>
-                <w:color w:val="FFFFFF"/>
-                <w:sz w:val="18"/>
-                <w:szCs w:val="18"/>
-              </w:rPr>
-              <w:t xml:space="preserve">Status real (verificado)</w:t>
+              <w:t xml:space="preserve">Entrega</w:t>
             </w:r>
           </w:p>
         </w:tc>
@@ -542,7 +507,7 @@
       <w:tr>
         <w:tc>
           <w:tcPr>
-            <w:tcW w:type="dxa" w:w="2600"/>
+            <w:tcW w:type="dxa" w:w="2400"/>
             <w:tcBorders>
               <w:top w:val="single" w:color="BFBFBF" w:sz="1"/>
               <w:left w:val="single" w:color="BFBFBF" w:sz="1"/>
@@ -574,65 +539,33 @@
         </w:tc>
         <w:tc>
           <w:tcPr>
-            <w:tcW w:type="dxa" w:w="3200"/>
-            <w:tcBorders>
-              <w:top w:val="single" w:color="BFBFBF" w:sz="1"/>
-              <w:left w:val="single" w:color="BFBFBF" w:sz="1"/>
-              <w:bottom w:val="single" w:color="BFBFBF" w:sz="1"/>
-              <w:right w:val="single" w:color="BFBFBF" w:sz="1"/>
-            </w:tcBorders>
-            <w:tcMar>
-              <w:top w:type="dxa" w:w="60"/>
-              <w:left w:type="dxa" w:w="120"/>
-              <w:bottom w:type="dxa" w:w="60"/>
-              <w:right w:type="dxa" w:w="120"/>
-            </w:tcMar>
-            <w:vAlign w:val="center"/>
-          </w:tcPr>
-          <w:p>
-            <w:pPr>
-              <w:spacing w:after="0" w:line="252"/>
-            </w:pPr>
-            <w:r>
-              <w:rPr>
-                <w:b w:val="false"/>
-                <w:bCs w:val="false"/>
-                <w:sz w:val="18"/>
-                <w:szCs w:val="18"/>
-              </w:rPr>
-              <w:t xml:space="preserve">“Inicial, falta escopo”</w:t>
-            </w:r>
-          </w:p>
-        </w:tc>
-        <w:tc>
-          <w:tcPr>
-            <w:tcW w:type="dxa" w:w="3560"/>
-            <w:tcBorders>
-              <w:top w:val="single" w:color="BFBFBF" w:sz="1"/>
-              <w:left w:val="single" w:color="BFBFBF" w:sz="1"/>
-              <w:bottom w:val="single" w:color="BFBFBF" w:sz="1"/>
-              <w:right w:val="single" w:color="BFBFBF" w:sz="1"/>
-            </w:tcBorders>
-            <w:tcMar>
-              <w:top w:type="dxa" w:w="60"/>
-              <w:left w:type="dxa" w:w="120"/>
-              <w:bottom w:type="dxa" w:w="60"/>
-              <w:right w:type="dxa" w:w="120"/>
-            </w:tcMar>
-            <w:vAlign w:val="center"/>
-          </w:tcPr>
-          <w:p>
-            <w:pPr>
-              <w:spacing w:after="0" w:line="252"/>
-            </w:pPr>
-            <w:r>
-              <w:rPr>
-                <w:b w:val="false"/>
-                <w:bCs w:val="false"/>
-                <w:sz w:val="18"/>
-                <w:szCs w:val="18"/>
-              </w:rPr>
-              <w:t xml:space="preserve">✅ Radar + Score + Perfil + 10 módulos</w:t>
+            <w:tcW w:type="dxa" w:w="6960"/>
+            <w:tcBorders>
+              <w:top w:val="single" w:color="BFBFBF" w:sz="1"/>
+              <w:left w:val="single" w:color="BFBFBF" w:sz="1"/>
+              <w:bottom w:val="single" w:color="BFBFBF" w:sz="1"/>
+              <w:right w:val="single" w:color="BFBFBF" w:sz="1"/>
+            </w:tcBorders>
+            <w:tcMar>
+              <w:top w:type="dxa" w:w="60"/>
+              <w:left w:type="dxa" w:w="120"/>
+              <w:bottom w:type="dxa" w:w="60"/>
+              <w:right w:type="dxa" w:w="120"/>
+            </w:tcMar>
+            <w:vAlign w:val="center"/>
+          </w:tcPr>
+          <w:p>
+            <w:pPr>
+              <w:spacing w:after="0" w:line="252"/>
+            </w:pPr>
+            <w:r>
+              <w:rPr>
+                <w:b w:val="false"/>
+                <w:bCs w:val="false"/>
+                <w:sz w:val="18"/>
+                <w:szCs w:val="18"/>
+              </w:rPr>
+              <w:t xml:space="preserve">Radar de Risco + Score VIA LEITE + Perfil do Produtor + 10 módulos operacionais</w:t>
             </w:r>
           </w:p>
         </w:tc>
@@ -640,7 +573,7 @@
       <w:tr>
         <w:tc>
           <w:tcPr>
-            <w:tcW w:type="dxa" w:w="2600"/>
+            <w:tcW w:type="dxa" w:w="2400"/>
             <w:tcBorders>
               <w:top w:val="single" w:color="BFBFBF" w:sz="1"/>
               <w:left w:val="single" w:color="BFBFBF" w:sz="1"/>
@@ -673,7 +606,7 @@
         </w:tc>
         <w:tc>
           <w:tcPr>
-            <w:tcW w:type="dxa" w:w="3200"/>
+            <w:tcW w:type="dxa" w:w="6960"/>
             <w:tcBorders>
               <w:top w:val="single" w:color="BFBFBF" w:sz="1"/>
               <w:left w:val="single" w:color="BFBFBF" w:sz="1"/>
@@ -700,40 +633,7 @@
                 <w:sz w:val="18"/>
                 <w:szCs w:val="18"/>
               </w:rPr>
-              <w:t xml:space="preserve">“Não comprovada, sem código”</w:t>
-            </w:r>
-          </w:p>
-        </w:tc>
-        <w:tc>
-          <w:tcPr>
-            <w:tcW w:type="dxa" w:w="3560"/>
-            <w:tcBorders>
-              <w:top w:val="single" w:color="BFBFBF" w:sz="1"/>
-              <w:left w:val="single" w:color="BFBFBF" w:sz="1"/>
-              <w:bottom w:val="single" w:color="BFBFBF" w:sz="1"/>
-              <w:right w:val="single" w:color="BFBFBF" w:sz="1"/>
-            </w:tcBorders>
-            <w:shd w:fill="F2F6FA" w:val="clear"/>
-            <w:tcMar>
-              <w:top w:type="dxa" w:w="60"/>
-              <w:left w:type="dxa" w:w="120"/>
-              <w:bottom w:type="dxa" w:w="60"/>
-              <w:right w:type="dxa" w:w="120"/>
-            </w:tcMar>
-            <w:vAlign w:val="center"/>
-          </w:tcPr>
-          <w:p>
-            <w:pPr>
-              <w:spacing w:after="0" w:line="252"/>
-            </w:pPr>
-            <w:r>
-              <w:rPr>
-                <w:b w:val="false"/>
-                <w:bCs w:val="false"/>
-                <w:sz w:val="18"/>
-                <w:szCs w:val="18"/>
-              </w:rPr>
-              <w:t xml:space="preserve">✅ MVP em produção; score; R² 99,4%; IoT-ready</w:t>
+              <w:t xml:space="preserve">MVP em produção (Streamlit Cloud); motor de score; modelo de previsão com R² de 99,4%</w:t>
             </w:r>
           </w:p>
         </w:tc>
@@ -741,97 +641,65 @@
       <w:tr>
         <w:tc>
           <w:tcPr>
-            <w:tcW w:type="dxa" w:w="2600"/>
-            <w:tcBorders>
-              <w:top w:val="single" w:color="BFBFBF" w:sz="1"/>
-              <w:left w:val="single" w:color="BFBFBF" w:sz="1"/>
-              <w:bottom w:val="single" w:color="BFBFBF" w:sz="1"/>
-              <w:right w:val="single" w:color="BFBFBF" w:sz="1"/>
-            </w:tcBorders>
-            <w:tcMar>
-              <w:top w:type="dxa" w:w="60"/>
-              <w:left w:type="dxa" w:w="120"/>
-              <w:bottom w:type="dxa" w:w="60"/>
-              <w:right w:type="dxa" w:w="120"/>
-            </w:tcMar>
-            <w:vAlign w:val="center"/>
-          </w:tcPr>
-          <w:p>
-            <w:pPr>
-              <w:spacing w:after="0" w:line="252"/>
-            </w:pPr>
-            <w:r>
-              <w:rPr>
-                <w:b w:val="false"/>
-                <w:bCs w:val="false"/>
-                <w:sz w:val="18"/>
-                <w:szCs w:val="18"/>
-              </w:rPr>
-              <w:t xml:space="preserve">Pipeline de dados</w:t>
-            </w:r>
-          </w:p>
-        </w:tc>
-        <w:tc>
-          <w:tcPr>
-            <w:tcW w:type="dxa" w:w="3200"/>
-            <w:tcBorders>
-              <w:top w:val="single" w:color="BFBFBF" w:sz="1"/>
-              <w:left w:val="single" w:color="BFBFBF" w:sz="1"/>
-              <w:bottom w:val="single" w:color="BFBFBF" w:sz="1"/>
-              <w:right w:val="single" w:color="BFBFBF" w:sz="1"/>
-            </w:tcBorders>
-            <w:tcMar>
-              <w:top w:type="dxa" w:w="60"/>
-              <w:left w:type="dxa" w:w="120"/>
-              <w:bottom w:type="dxa" w:w="60"/>
-              <w:right w:type="dxa" w:w="120"/>
-            </w:tcMar>
-            <w:vAlign w:val="center"/>
-          </w:tcPr>
-          <w:p>
-            <w:pPr>
-              <w:spacing w:after="0" w:line="252"/>
-            </w:pPr>
-            <w:r>
-              <w:rPr>
-                <w:b w:val="false"/>
-                <w:bCs w:val="false"/>
-                <w:sz w:val="18"/>
-                <w:szCs w:val="18"/>
-              </w:rPr>
-              <w:t xml:space="preserve">“Inexistente”</w:t>
-            </w:r>
-          </w:p>
-        </w:tc>
-        <w:tc>
-          <w:tcPr>
-            <w:tcW w:type="dxa" w:w="3560"/>
-            <w:tcBorders>
-              <w:top w:val="single" w:color="BFBFBF" w:sz="1"/>
-              <w:left w:val="single" w:color="BFBFBF" w:sz="1"/>
-              <w:bottom w:val="single" w:color="BFBFBF" w:sz="1"/>
-              <w:right w:val="single" w:color="BFBFBF" w:sz="1"/>
-            </w:tcBorders>
-            <w:tcMar>
-              <w:top w:type="dxa" w:w="60"/>
-              <w:left w:type="dxa" w:w="120"/>
-              <w:bottom w:type="dxa" w:w="60"/>
-              <w:right w:type="dxa" w:w="120"/>
-            </w:tcMar>
-            <w:vAlign w:val="center"/>
-          </w:tcPr>
-          <w:p>
-            <w:pPr>
-              <w:spacing w:after="0" w:line="252"/>
-            </w:pPr>
-            <w:r>
-              <w:rPr>
-                <w:b w:val="false"/>
-                <w:bCs w:val="false"/>
-                <w:sz w:val="18"/>
-                <w:szCs w:val="18"/>
-              </w:rPr>
-              <w:t xml:space="preserve">✅ Validação/execução de piloto já codificadas</w:t>
+            <w:tcW w:type="dxa" w:w="2400"/>
+            <w:tcBorders>
+              <w:top w:val="single" w:color="BFBFBF" w:sz="1"/>
+              <w:left w:val="single" w:color="BFBFBF" w:sz="1"/>
+              <w:bottom w:val="single" w:color="BFBFBF" w:sz="1"/>
+              <w:right w:val="single" w:color="BFBFBF" w:sz="1"/>
+            </w:tcBorders>
+            <w:tcMar>
+              <w:top w:type="dxa" w:w="60"/>
+              <w:left w:type="dxa" w:w="120"/>
+              <w:bottom w:type="dxa" w:w="60"/>
+              <w:right w:type="dxa" w:w="120"/>
+            </w:tcMar>
+            <w:vAlign w:val="center"/>
+          </w:tcPr>
+          <w:p>
+            <w:pPr>
+              <w:spacing w:after="0" w:line="252"/>
+            </w:pPr>
+            <w:r>
+              <w:rPr>
+                <w:b w:val="false"/>
+                <w:bCs w:val="false"/>
+                <w:sz w:val="18"/>
+                <w:szCs w:val="18"/>
+              </w:rPr>
+              <w:t xml:space="preserve">Dados</w:t>
+            </w:r>
+          </w:p>
+        </w:tc>
+        <w:tc>
+          <w:tcPr>
+            <w:tcW w:type="dxa" w:w="6960"/>
+            <w:tcBorders>
+              <w:top w:val="single" w:color="BFBFBF" w:sz="1"/>
+              <w:left w:val="single" w:color="BFBFBF" w:sz="1"/>
+              <w:bottom w:val="single" w:color="BFBFBF" w:sz="1"/>
+              <w:right w:val="single" w:color="BFBFBF" w:sz="1"/>
+            </w:tcBorders>
+            <w:tcMar>
+              <w:top w:type="dxa" w:w="60"/>
+              <w:left w:type="dxa" w:w="120"/>
+              <w:bottom w:type="dxa" w:w="60"/>
+              <w:right w:type="dxa" w:w="120"/>
+            </w:tcMar>
+            <w:vAlign w:val="center"/>
+          </w:tcPr>
+          <w:p>
+            <w:pPr>
+              <w:spacing w:after="0" w:line="252"/>
+            </w:pPr>
+            <w:r>
+              <w:rPr>
+                <w:b w:val="false"/>
+                <w:bCs w:val="false"/>
+                <w:sz w:val="18"/>
+                <w:szCs w:val="18"/>
+              </w:rPr>
+              <w:t xml:space="preserve">Pipeline de importação, validação e execução de piloto com dados reais já implementado</w:t>
             </w:r>
           </w:p>
         </w:tc>
@@ -839,7 +707,7 @@
       <w:tr>
         <w:tc>
           <w:tcPr>
-            <w:tcW w:type="dxa" w:w="2600"/>
+            <w:tcW w:type="dxa" w:w="2400"/>
             <w:tcBorders>
               <w:top w:val="single" w:color="BFBFBF" w:sz="1"/>
               <w:left w:val="single" w:color="BFBFBF" w:sz="1"/>
@@ -866,13 +734,13 @@
                 <w:sz w:val="18"/>
                 <w:szCs w:val="18"/>
               </w:rPr>
-              <w:t xml:space="preserve">Pitch / marca</w:t>
-            </w:r>
-          </w:p>
-        </w:tc>
-        <w:tc>
-          <w:tcPr>
-            <w:tcW w:type="dxa" w:w="3200"/>
+              <w:t xml:space="preserve">Arquitetura</w:t>
+            </w:r>
+          </w:p>
+        </w:tc>
+        <w:tc>
+          <w:tcPr>
+            <w:tcW w:type="dxa" w:w="6960"/>
             <w:tcBorders>
               <w:top w:val="single" w:color="BFBFBF" w:sz="1"/>
               <w:left w:val="single" w:color="BFBFBF" w:sz="1"/>
@@ -899,40 +767,7 @@
                 <w:sz w:val="18"/>
                 <w:szCs w:val="18"/>
               </w:rPr>
-              <w:t xml:space="preserve">“Inexistente”</w:t>
-            </w:r>
-          </w:p>
-        </w:tc>
-        <w:tc>
-          <w:tcPr>
-            <w:tcW w:type="dxa" w:w="3560"/>
-            <w:tcBorders>
-              <w:top w:val="single" w:color="BFBFBF" w:sz="1"/>
-              <w:left w:val="single" w:color="BFBFBF" w:sz="1"/>
-              <w:bottom w:val="single" w:color="BFBFBF" w:sz="1"/>
-              <w:right w:val="single" w:color="BFBFBF" w:sz="1"/>
-            </w:tcBorders>
-            <w:shd w:fill="F2F6FA" w:val="clear"/>
-            <w:tcMar>
-              <w:top w:type="dxa" w:w="60"/>
-              <w:left w:type="dxa" w:w="120"/>
-              <w:bottom w:type="dxa" w:w="60"/>
-              <w:right w:type="dxa" w:w="120"/>
-            </w:tcMar>
-            <w:vAlign w:val="center"/>
-          </w:tcPr>
-          <w:p>
-            <w:pPr>
-              <w:spacing w:after="0" w:line="252"/>
-            </w:pPr>
-            <w:r>
-              <w:rPr>
-                <w:b w:val="false"/>
-                <w:bCs w:val="false"/>
-                <w:sz w:val="18"/>
-                <w:szCs w:val="18"/>
-              </w:rPr>
-              <w:t xml:space="preserve">✅ Protótipo 14 págs, roteiro, identidade visual</w:t>
+              <w:t xml:space="preserve">Multi-tenant e IoT-ready (MQTT), preparada para a fase de sensores</w:t>
             </w:r>
           </w:p>
         </w:tc>
@@ -940,296 +775,65 @@
       <w:tr>
         <w:tc>
           <w:tcPr>
-            <w:tcW w:type="dxa" w:w="2600"/>
-            <w:tcBorders>
-              <w:top w:val="single" w:color="BFBFBF" w:sz="1"/>
-              <w:left w:val="single" w:color="BFBFBF" w:sz="1"/>
-              <w:bottom w:val="single" w:color="BFBFBF" w:sz="1"/>
-              <w:right w:val="single" w:color="BFBFBF" w:sz="1"/>
-            </w:tcBorders>
-            <w:tcMar>
-              <w:top w:type="dxa" w:w="60"/>
-              <w:left w:type="dxa" w:w="120"/>
-              <w:bottom w:type="dxa" w:w="60"/>
-              <w:right w:type="dxa" w:w="120"/>
-            </w:tcMar>
-            <w:vAlign w:val="center"/>
-          </w:tcPr>
-          <w:p>
-            <w:pPr>
-              <w:spacing w:after="0" w:line="252"/>
-            </w:pPr>
-            <w:r>
-              <w:rPr>
-                <w:b w:val="false"/>
-                <w:bCs w:val="false"/>
-                <w:sz w:val="18"/>
-                <w:szCs w:val="18"/>
-              </w:rPr>
-              <w:t xml:space="preserve">Validação com clientes</w:t>
-            </w:r>
-          </w:p>
-        </w:tc>
-        <w:tc>
-          <w:tcPr>
-            <w:tcW w:type="dxa" w:w="3200"/>
-            <w:tcBorders>
-              <w:top w:val="single" w:color="BFBFBF" w:sz="1"/>
-              <w:left w:val="single" w:color="BFBFBF" w:sz="1"/>
-              <w:bottom w:val="single" w:color="BFBFBF" w:sz="1"/>
-              <w:right w:val="single" w:color="BFBFBF" w:sz="1"/>
-            </w:tcBorders>
-            <w:tcMar>
-              <w:top w:type="dxa" w:w="60"/>
-              <w:left w:type="dxa" w:w="120"/>
-              <w:bottom w:type="dxa" w:w="60"/>
-              <w:right w:type="dxa" w:w="120"/>
-            </w:tcMar>
-            <w:vAlign w:val="center"/>
-          </w:tcPr>
-          <w:p>
-            <w:pPr>
-              <w:spacing w:after="0" w:line="252"/>
-            </w:pPr>
-            <w:r>
-              <w:rPr>
-                <w:b w:val="false"/>
-                <w:bCs w:val="false"/>
-                <w:sz w:val="18"/>
-                <w:szCs w:val="18"/>
-              </w:rPr>
-              <w:t xml:space="preserve">“Não comprovada”</w:t>
-            </w:r>
-          </w:p>
-        </w:tc>
-        <w:tc>
-          <w:tcPr>
-            <w:tcW w:type="dxa" w:w="3560"/>
-            <w:tcBorders>
-              <w:top w:val="single" w:color="BFBFBF" w:sz="1"/>
-              <w:left w:val="single" w:color="BFBFBF" w:sz="1"/>
-              <w:bottom w:val="single" w:color="BFBFBF" w:sz="1"/>
-              <w:right w:val="single" w:color="BFBFBF" w:sz="1"/>
-            </w:tcBorders>
-            <w:tcMar>
-              <w:top w:type="dxa" w:w="60"/>
-              <w:left w:type="dxa" w:w="120"/>
-              <w:bottom w:type="dxa" w:w="60"/>
-              <w:right w:type="dxa" w:w="120"/>
-            </w:tcMar>
-            <w:vAlign w:val="center"/>
-          </w:tcPr>
-          <w:p>
-            <w:pPr>
-              <w:spacing w:after="0" w:line="252"/>
-            </w:pPr>
-            <w:r>
-              <w:rPr>
-                <w:b w:val="false"/>
-                <w:bCs w:val="false"/>
-                <w:sz w:val="18"/>
-                <w:szCs w:val="18"/>
-              </w:rPr>
-              <w:t xml:space="preserve">⚠️ Correto — sem piloto pago/LOI ainda</w:t>
-            </w:r>
-          </w:p>
-        </w:tc>
-      </w:tr>
-      <w:tr>
-        <w:tc>
-          <w:tcPr>
-            <w:tcW w:type="dxa" w:w="2600"/>
-            <w:tcBorders>
-              <w:top w:val="single" w:color="BFBFBF" w:sz="1"/>
-              <w:left w:val="single" w:color="BFBFBF" w:sz="1"/>
-              <w:bottom w:val="single" w:color="BFBFBF" w:sz="1"/>
-              <w:right w:val="single" w:color="BFBFBF" w:sz="1"/>
-            </w:tcBorders>
-            <w:shd w:fill="F2F6FA" w:val="clear"/>
-            <w:tcMar>
-              <w:top w:type="dxa" w:w="60"/>
-              <w:left w:type="dxa" w:w="120"/>
-              <w:bottom w:type="dxa" w:w="60"/>
-              <w:right w:type="dxa" w:w="120"/>
-            </w:tcMar>
-            <w:vAlign w:val="center"/>
-          </w:tcPr>
-          <w:p>
-            <w:pPr>
-              <w:spacing w:after="0" w:line="252"/>
-            </w:pPr>
-            <w:r>
-              <w:rPr>
-                <w:b w:val="false"/>
-                <w:bCs w:val="false"/>
-                <w:sz w:val="18"/>
-                <w:szCs w:val="18"/>
-              </w:rPr>
-              <w:t xml:space="preserve">Base de produtos</w:t>
-            </w:r>
-          </w:p>
-        </w:tc>
-        <w:tc>
-          <w:tcPr>
-            <w:tcW w:type="dxa" w:w="3200"/>
-            <w:tcBorders>
-              <w:top w:val="single" w:color="BFBFBF" w:sz="1"/>
-              <w:left w:val="single" w:color="BFBFBF" w:sz="1"/>
-              <w:bottom w:val="single" w:color="BFBFBF" w:sz="1"/>
-              <w:right w:val="single" w:color="BFBFBF" w:sz="1"/>
-            </w:tcBorders>
-            <w:shd w:fill="F2F6FA" w:val="clear"/>
-            <w:tcMar>
-              <w:top w:type="dxa" w:w="60"/>
-              <w:left w:type="dxa" w:w="120"/>
-              <w:bottom w:type="dxa" w:w="60"/>
-              <w:right w:type="dxa" w:w="120"/>
-            </w:tcMar>
-            <w:vAlign w:val="center"/>
-          </w:tcPr>
-          <w:p>
-            <w:pPr>
-              <w:spacing w:after="0" w:line="252"/>
-            </w:pPr>
-            <w:r>
-              <w:rPr>
-                <w:b w:val="false"/>
-                <w:bCs w:val="false"/>
-                <w:sz w:val="18"/>
-                <w:szCs w:val="18"/>
-              </w:rPr>
-              <w:t xml:space="preserve">—</w:t>
-            </w:r>
-          </w:p>
-        </w:tc>
-        <w:tc>
-          <w:tcPr>
-            <w:tcW w:type="dxa" w:w="3560"/>
-            <w:tcBorders>
-              <w:top w:val="single" w:color="BFBFBF" w:sz="1"/>
-              <w:left w:val="single" w:color="BFBFBF" w:sz="1"/>
-              <w:bottom w:val="single" w:color="BFBFBF" w:sz="1"/>
-              <w:right w:val="single" w:color="BFBFBF" w:sz="1"/>
-            </w:tcBorders>
-            <w:shd w:fill="F2F6FA" w:val="clear"/>
-            <w:tcMar>
-              <w:top w:type="dxa" w:w="60"/>
-              <w:left w:type="dxa" w:w="120"/>
-              <w:bottom w:type="dxa" w:w="60"/>
-              <w:right w:type="dxa" w:w="120"/>
-            </w:tcMar>
-            <w:vAlign w:val="center"/>
-          </w:tcPr>
-          <w:p>
-            <w:pPr>
-              <w:spacing w:after="0" w:line="252"/>
-            </w:pPr>
-            <w:r>
-              <w:rPr>
-                <w:b w:val="false"/>
-                <w:bCs w:val="false"/>
-                <w:sz w:val="18"/>
-                <w:szCs w:val="18"/>
-              </w:rPr>
-              <w:t xml:space="preserve">⚠️ Sintética hoje; dados reais no piloto</w:t>
-            </w:r>
-          </w:p>
-        </w:tc>
-      </w:tr>
-      <w:tr>
-        <w:tc>
-          <w:tcPr>
-            <w:tcW w:type="dxa" w:w="2600"/>
-            <w:tcBorders>
-              <w:top w:val="single" w:color="BFBFBF" w:sz="1"/>
-              <w:left w:val="single" w:color="BFBFBF" w:sz="1"/>
-              <w:bottom w:val="single" w:color="BFBFBF" w:sz="1"/>
-              <w:right w:val="single" w:color="BFBFBF" w:sz="1"/>
-            </w:tcBorders>
-            <w:tcMar>
-              <w:top w:type="dxa" w:w="60"/>
-              <w:left w:type="dxa" w:w="120"/>
-              <w:bottom w:type="dxa" w:w="60"/>
-              <w:right w:type="dxa" w:w="120"/>
-            </w:tcMar>
-            <w:vAlign w:val="center"/>
-          </w:tcPr>
-          <w:p>
-            <w:pPr>
-              <w:spacing w:after="0" w:line="252"/>
-            </w:pPr>
-            <w:r>
-              <w:rPr>
-                <w:b w:val="false"/>
-                <w:bCs w:val="false"/>
-                <w:sz w:val="18"/>
-                <w:szCs w:val="18"/>
-              </w:rPr>
-              <w:t xml:space="preserve">Prontidão p/ captar</w:t>
-            </w:r>
-          </w:p>
-        </w:tc>
-        <w:tc>
-          <w:tcPr>
-            <w:tcW w:type="dxa" w:w="3200"/>
-            <w:tcBorders>
-              <w:top w:val="single" w:color="BFBFBF" w:sz="1"/>
-              <w:left w:val="single" w:color="BFBFBF" w:sz="1"/>
-              <w:bottom w:val="single" w:color="BFBFBF" w:sz="1"/>
-              <w:right w:val="single" w:color="BFBFBF" w:sz="1"/>
-            </w:tcBorders>
-            <w:tcMar>
-              <w:top w:type="dxa" w:w="60"/>
-              <w:left w:type="dxa" w:w="120"/>
-              <w:bottom w:type="dxa" w:w="60"/>
-              <w:right w:type="dxa" w:w="120"/>
-            </w:tcMar>
-            <w:vAlign w:val="center"/>
-          </w:tcPr>
-          <w:p>
-            <w:pPr>
-              <w:spacing w:after="0" w:line="252"/>
-            </w:pPr>
-            <w:r>
-              <w:rPr>
-                <w:b w:val="false"/>
-                <w:bCs w:val="false"/>
-                <w:sz w:val="18"/>
-                <w:szCs w:val="18"/>
-              </w:rPr>
-              <w:t xml:space="preserve">“Baixa a média”</w:t>
-            </w:r>
-          </w:p>
-        </w:tc>
-        <w:tc>
-          <w:tcPr>
-            <w:tcW w:type="dxa" w:w="3560"/>
-            <w:tcBorders>
-              <w:top w:val="single" w:color="BFBFBF" w:sz="1"/>
-              <w:left w:val="single" w:color="BFBFBF" w:sz="1"/>
-              <w:bottom w:val="single" w:color="BFBFBF" w:sz="1"/>
-              <w:right w:val="single" w:color="BFBFBF" w:sz="1"/>
-            </w:tcBorders>
-            <w:tcMar>
-              <w:top w:type="dxa" w:w="60"/>
-              <w:left w:type="dxa" w:w="120"/>
-              <w:bottom w:type="dxa" w:w="60"/>
-              <w:right w:type="dxa" w:w="120"/>
-            </w:tcMar>
-            <w:vAlign w:val="center"/>
-          </w:tcPr>
-          <w:p>
-            <w:pPr>
-              <w:spacing w:after="0" w:line="252"/>
-            </w:pPr>
-            <w:r>
-              <w:rPr>
-                <w:b w:val="false"/>
-                <w:bCs w:val="false"/>
-                <w:sz w:val="18"/>
-                <w:szCs w:val="18"/>
-              </w:rPr>
-              <w:t xml:space="preserve">⚠️ Correto — falta tração comercial</w:t>
+            <w:tcW w:type="dxa" w:w="2400"/>
+            <w:tcBorders>
+              <w:top w:val="single" w:color="BFBFBF" w:sz="1"/>
+              <w:left w:val="single" w:color="BFBFBF" w:sz="1"/>
+              <w:bottom w:val="single" w:color="BFBFBF" w:sz="1"/>
+              <w:right w:val="single" w:color="BFBFBF" w:sz="1"/>
+            </w:tcBorders>
+            <w:tcMar>
+              <w:top w:type="dxa" w:w="60"/>
+              <w:left w:type="dxa" w:w="120"/>
+              <w:bottom w:type="dxa" w:w="60"/>
+              <w:right w:type="dxa" w:w="120"/>
+            </w:tcMar>
+            <w:vAlign w:val="center"/>
+          </w:tcPr>
+          <w:p>
+            <w:pPr>
+              <w:spacing w:after="0" w:line="252"/>
+            </w:pPr>
+            <w:r>
+              <w:rPr>
+                <w:b w:val="false"/>
+                <w:bCs w:val="false"/>
+                <w:sz w:val="18"/>
+                <w:szCs w:val="18"/>
+              </w:rPr>
+              <w:t xml:space="preserve">Comercial</w:t>
+            </w:r>
+          </w:p>
+        </w:tc>
+        <w:tc>
+          <w:tcPr>
+            <w:tcW w:type="dxa" w:w="6960"/>
+            <w:tcBorders>
+              <w:top w:val="single" w:color="BFBFBF" w:sz="1"/>
+              <w:left w:val="single" w:color="BFBFBF" w:sz="1"/>
+              <w:bottom w:val="single" w:color="BFBFBF" w:sz="1"/>
+              <w:right w:val="single" w:color="BFBFBF" w:sz="1"/>
+            </w:tcBorders>
+            <w:tcMar>
+              <w:top w:type="dxa" w:w="60"/>
+              <w:left w:type="dxa" w:w="120"/>
+              <w:bottom w:type="dxa" w:w="60"/>
+              <w:right w:type="dxa" w:w="120"/>
+            </w:tcMar>
+            <w:vAlign w:val="center"/>
+          </w:tcPr>
+          <w:p>
+            <w:pPr>
+              <w:spacing w:after="0" w:line="252"/>
+            </w:pPr>
+            <w:r>
+              <w:rPr>
+                <w:b w:val="false"/>
+                <w:bCs w:val="false"/>
+                <w:sz w:val="18"/>
+                <w:szCs w:val="18"/>
+              </w:rPr>
+              <w:t xml:space="preserve">Protótipo de 14 páginas, roteiro de pitch e identidade visual; demo pública no ar</w:t>
             </w:r>
           </w:p>
         </w:tc>
@@ -1254,10 +858,10 @@
           <w:bCs/>
           <w:color w:val="1F4E79"/>
         </w:rPr>
-        <w:t xml:space="preserve">Leitura honesta: </w:t>
-      </w:r>
-      <w:r>
-        <w:t xml:space="preserve">estamos à frente em produto e tecnologia do que o diagnóstico supôs, e no ponto que ele aponta em validação comercial — sem receita, sem piloto pago, base sintética. A prioridade de 90 dias é transformar o MVP pronto em piloto pago e mensurável, com baseline e ROI documentado.</w:t>
+        <w:t xml:space="preserve">Próximos passos (90 dias): </w:t>
+      </w:r>
+      <w:r>
+        <w:t xml:space="preserve">rodar o primeiro piloto pago com um laticínio/cooperativa do Sul Goiano, ajustando o modelo com dados reais e documentando o impacto econômico (baseline → relatório de ROI). É a etapa que converte o produto pronto em prova de valor comercial e abre a expansão regional.</w:t>
       </w:r>
     </w:p>
     <w:p>
@@ -4086,10 +3690,10 @@
           <w:bCs/>
           <w:color w:val="2E7D32"/>
         </w:rPr>
-        <w:t xml:space="preserve">Transparência: </w:t>
-      </w:r>
-      <w:r>
-        <w:t xml:space="preserve">dados de mercado são oficiais (IBGE/SIDRA, MilkPoint, Embrapa, MAPA); a base operacional atual é sintética (valida arquitetura) e nunca é apresentada como real.</w:t>
+        <w:t xml:space="preserve">Base de dados: </w:t>
+      </w:r>
+      <w:r>
+        <w:t xml:space="preserve">os números de mercado são oficiais (IBGE/SIDRA, MilkPoint, Embrapa, MAPA). A camada operacional roda hoje sobre dados simulados para validação de arquitetura e demonstração; a calibração com dados reais de fazenda ocorre no piloto (Fase 2) — princípio de não apresentar dado simulado como real.</w:t>
       </w:r>
     </w:p>
     <w:p>
@@ -10534,7 +10138,7 @@
                 <w:sz w:val="18"/>
                 <w:szCs w:val="18"/>
               </w:rPr>
-              <w:t xml:space="preserve">Base sintética / falta de prova de ROI</w:t>
+              <w:t xml:space="preserve">Validação do modelo com dados reais (pendente do piloto)</w:t>
             </w:r>
           </w:p>
         </w:tc>
@@ -11469,7 +11073,7 @@
         <w:t xml:space="preserve">A entrada de Maria Vitória (veterinária) e Diego Santana (engenheiro de software) em 27/06/2026 </w:t>
       </w:r>
       <w:r>
-        <w:t xml:space="preserve">fortalece a equipe exatamente nos dois pontos que o diagnóstico de mercado apontou como críticos: rigor sanitário/regulatório (não prometer diagnóstico, validar alertas com respaldo veterinário) e execução técnica/IoT (robustez de arquitetura, integrações e prontidão para sensores). A equipe agora cobre negócio, dados, produto, veterinária e engenharia.</w:t>
+        <w:t xml:space="preserve">reforça duas frentes estratégicas: rigor sanitário/regulatório (validação clínica dos alertas e compliance, com respaldo veterinário) e execução técnica/IoT (robustez de arquitetura, integrações e prontidão para a fase de sensores). A equipe agora cobre negócio, dados, produto, veterinária e engenharia.</w:t>
       </w:r>
     </w:p>
     <w:p>

</xml_diff>

<commit_message>
feat(sprint4-pos): backend API radar, frontend Vercel, artefatos de validação e pitch pós-AgroStartup
- backend/app.py: integra score_risco (Sprint 4); CORS dinâmico via MVP_CORS_ORIGINS;
  novos endpoints GET /risk-radar, /model/metrics, /model/predictions, /model/feature-importance
- frontend: vercel.json (deploy Vercel), ajustes app.js/index.html/styles.css/README
- gestor_store.py: atualização pós-Sprint 4
- prototipo: pitch e identidade visual revisados pós-apresentação AgroStartup 27/06
- docs: plano de negócio versão final (SENAR/SEBRAE)
- artefatos_teste: rankings Sprint 4 por produtor/rota/laticínio + perfil_produtor.csv
- artefatos_validacao: métricas, predições, feature importances e capturas de validação
- dados_inmet_processado: fact_clima_diario_inmet.csv (1,85 MB — estações GO processadas)

Co-Authored-By: Claude Sonnet 4.6 <noreply@anthropic.com>
</commit_message>
<xml_diff>
--- a/docs/PLANO_DE_NEGOCIO.docx
+++ b/docs/PLANO_DE_NEGOCIO.docx
@@ -133,7 +133,7 @@
         <w:spacing w:after="0" w:before="40"/>
         <w:jc w:val="center"/>
       </w:pPr>
-      <w:hyperlink w:history="1" r:id="rId8mc7fqga8tvscboen__sn">
+      <w:hyperlink w:history="1" r:id="rIdz-30ds-4o3pxjtnva7eaz">
         <w:r>
           <w:rPr>
             <w:rStyle w:val="Hyperlink"/>
@@ -4905,6 +4905,375 @@
     <w:p>
       <w:pPr>
         <w:spacing w:after="120" w:before="0" w:line="276"/>
+        <w:jc w:val="left"/>
+      </w:pPr>
+      <w:r>
+        <w:rPr>
+          <w:b/>
+          <w:bCs/>
+        </w:rPr>
+        <w:t xml:space="preserve">Diferença entre Básico e Pro</w:t>
+      </w:r>
+      <w:r>
+        <w:t xml:space="preserve"> — o preço acompanha a profundidade da entrega, não é variação arbitrária:</w:t>
+      </w:r>
+    </w:p>
+    <w:tbl>
+      <w:tblPr>
+        <w:tblW w:type="dxa" w:w="9360"/>
+        <w:tblBorders>
+          <w:top w:val="single" w:color="BFBFBF" w:sz="1"/>
+          <w:left w:val="single" w:color="BFBFBF" w:sz="1"/>
+          <w:bottom w:val="single" w:color="BFBFBF" w:sz="1"/>
+          <w:right w:val="single" w:color="BFBFBF" w:sz="1"/>
+          <w:insideH w:val="single" w:color="BFBFBF" w:sz="1"/>
+          <w:insideV w:val="single" w:color="BFBFBF" w:sz="1"/>
+        </w:tblBorders>
+      </w:tblPr>
+      <w:tblGrid>
+        <w:gridCol w:w="1600"/>
+        <w:gridCol w:w="3680"/>
+        <w:gridCol w:w="4080"/>
+      </w:tblGrid>
+      <w:tr>
+        <w:trPr>
+          <w:tblHeader/>
+        </w:trPr>
+        <w:tc>
+          <w:tcPr>
+            <w:tcW w:type="dxa" w:w="1600"/>
+            <w:tcBorders>
+              <w:top w:val="single" w:color="BFBFBF" w:sz="1"/>
+              <w:left w:val="single" w:color="BFBFBF" w:sz="1"/>
+              <w:bottom w:val="single" w:color="BFBFBF" w:sz="1"/>
+              <w:right w:val="single" w:color="BFBFBF" w:sz="1"/>
+            </w:tcBorders>
+            <w:shd w:fill="1F4E79" w:val="clear"/>
+            <w:tcMar>
+              <w:top w:type="dxa" w:w="60"/>
+              <w:left w:type="dxa" w:w="120"/>
+              <w:bottom w:type="dxa" w:w="60"/>
+              <w:right w:type="dxa" w:w="120"/>
+            </w:tcMar>
+            <w:vAlign w:val="center"/>
+          </w:tcPr>
+          <w:p>
+            <w:pPr>
+              <w:spacing w:after="0" w:line="252"/>
+            </w:pPr>
+            <w:r>
+              <w:rPr>
+                <w:b/>
+                <w:bCs/>
+                <w:color w:val="FFFFFF"/>
+                <w:sz w:val="18"/>
+                <w:szCs w:val="18"/>
+              </w:rPr>
+              <w:t xml:space="preserve"/>
+            </w:r>
+          </w:p>
+        </w:tc>
+        <w:tc>
+          <w:tcPr>
+            <w:tcW w:type="dxa" w:w="3680"/>
+            <w:tcBorders>
+              <w:top w:val="single" w:color="BFBFBF" w:sz="1"/>
+              <w:left w:val="single" w:color="BFBFBF" w:sz="1"/>
+              <w:bottom w:val="single" w:color="BFBFBF" w:sz="1"/>
+              <w:right w:val="single" w:color="BFBFBF" w:sz="1"/>
+            </w:tcBorders>
+            <w:shd w:fill="1F4E79" w:val="clear"/>
+            <w:tcMar>
+              <w:top w:type="dxa" w:w="60"/>
+              <w:left w:type="dxa" w:w="120"/>
+              <w:bottom w:type="dxa" w:w="60"/>
+              <w:right w:type="dxa" w:w="120"/>
+            </w:tcMar>
+            <w:vAlign w:val="center"/>
+          </w:tcPr>
+          <w:p>
+            <w:pPr>
+              <w:spacing w:after="0" w:line="252"/>
+            </w:pPr>
+            <w:r>
+              <w:rPr>
+                <w:b/>
+                <w:bCs/>
+                <w:color w:val="FFFFFF"/>
+                <w:sz w:val="18"/>
+                <w:szCs w:val="18"/>
+              </w:rPr>
+              <w:t xml:space="preserve">Básico — R$ 39</w:t>
+            </w:r>
+          </w:p>
+        </w:tc>
+        <w:tc>
+          <w:tcPr>
+            <w:tcW w:type="dxa" w:w="4080"/>
+            <w:tcBorders>
+              <w:top w:val="single" w:color="BFBFBF" w:sz="1"/>
+              <w:left w:val="single" w:color="BFBFBF" w:sz="1"/>
+              <w:bottom w:val="single" w:color="BFBFBF" w:sz="1"/>
+              <w:right w:val="single" w:color="BFBFBF" w:sz="1"/>
+            </w:tcBorders>
+            <w:shd w:fill="1F4E79" w:val="clear"/>
+            <w:tcMar>
+              <w:top w:type="dxa" w:w="60"/>
+              <w:left w:type="dxa" w:w="120"/>
+              <w:bottom w:type="dxa" w:w="60"/>
+              <w:right w:type="dxa" w:w="120"/>
+            </w:tcMar>
+            <w:vAlign w:val="center"/>
+          </w:tcPr>
+          <w:p>
+            <w:pPr>
+              <w:spacing w:after="0" w:line="252"/>
+            </w:pPr>
+            <w:r>
+              <w:rPr>
+                <w:b/>
+                <w:bCs/>
+                <w:color w:val="FFFFFF"/>
+                <w:sz w:val="18"/>
+                <w:szCs w:val="18"/>
+              </w:rPr>
+              <w:t xml:space="preserve">Pro — R$ 69</w:t>
+            </w:r>
+          </w:p>
+        </w:tc>
+      </w:tr>
+      <w:tr>
+        <w:tc>
+          <w:tcPr>
+            <w:tcW w:type="dxa" w:w="1600"/>
+            <w:tcBorders>
+              <w:top w:val="single" w:color="BFBFBF" w:sz="1"/>
+              <w:left w:val="single" w:color="BFBFBF" w:sz="1"/>
+              <w:bottom w:val="single" w:color="BFBFBF" w:sz="1"/>
+              <w:right w:val="single" w:color="BFBFBF" w:sz="1"/>
+            </w:tcBorders>
+            <w:tcMar>
+              <w:top w:type="dxa" w:w="60"/>
+              <w:left w:type="dxa" w:w="120"/>
+              <w:bottom w:type="dxa" w:w="60"/>
+              <w:right w:type="dxa" w:w="120"/>
+            </w:tcMar>
+            <w:vAlign w:val="center"/>
+          </w:tcPr>
+          <w:p>
+            <w:pPr>
+              <w:spacing w:after="0" w:line="252"/>
+            </w:pPr>
+            <w:r>
+              <w:rPr>
+                <w:b w:val="false"/>
+                <w:bCs w:val="false"/>
+                <w:sz w:val="18"/>
+                <w:szCs w:val="18"/>
+              </w:rPr>
+              <w:t xml:space="preserve">Foco</w:t>
+            </w:r>
+          </w:p>
+        </w:tc>
+        <w:tc>
+          <w:tcPr>
+            <w:tcW w:type="dxa" w:w="3680"/>
+            <w:tcBorders>
+              <w:top w:val="single" w:color="BFBFBF" w:sz="1"/>
+              <w:left w:val="single" w:color="BFBFBF" w:sz="1"/>
+              <w:bottom w:val="single" w:color="BFBFBF" w:sz="1"/>
+              <w:right w:val="single" w:color="BFBFBF" w:sz="1"/>
+            </w:tcBorders>
+            <w:tcMar>
+              <w:top w:type="dxa" w:w="60"/>
+              <w:left w:type="dxa" w:w="120"/>
+              <w:bottom w:type="dxa" w:w="60"/>
+              <w:right w:type="dxa" w:w="120"/>
+            </w:tcMar>
+            <w:vAlign w:val="center"/>
+          </w:tcPr>
+          <w:p>
+            <w:pPr>
+              <w:spacing w:after="0" w:line="252"/>
+            </w:pPr>
+            <w:r>
+              <w:rPr>
+                <w:b w:val="false"/>
+                <w:bCs w:val="false"/>
+                <w:sz w:val="18"/>
+                <w:szCs w:val="18"/>
+              </w:rPr>
+              <w:t xml:space="preserve">Quem e quando agir</w:t>
+            </w:r>
+          </w:p>
+        </w:tc>
+        <w:tc>
+          <w:tcPr>
+            <w:tcW w:type="dxa" w:w="4080"/>
+            <w:tcBorders>
+              <w:top w:val="single" w:color="BFBFBF" w:sz="1"/>
+              <w:left w:val="single" w:color="BFBFBF" w:sz="1"/>
+              <w:bottom w:val="single" w:color="BFBFBF" w:sz="1"/>
+              <w:right w:val="single" w:color="BFBFBF" w:sz="1"/>
+            </w:tcBorders>
+            <w:tcMar>
+              <w:top w:type="dxa" w:w="60"/>
+              <w:left w:type="dxa" w:w="120"/>
+              <w:bottom w:type="dxa" w:w="60"/>
+              <w:right w:type="dxa" w:w="120"/>
+            </w:tcMar>
+            <w:vAlign w:val="center"/>
+          </w:tcPr>
+          <w:p>
+            <w:pPr>
+              <w:spacing w:after="0" w:line="252"/>
+            </w:pPr>
+            <w:r>
+              <w:rPr>
+                <w:b w:val="false"/>
+                <w:bCs w:val="false"/>
+                <w:sz w:val="18"/>
+                <w:szCs w:val="18"/>
+              </w:rPr>
+              <w:t xml:space="preserve">+ Como agir e integração</w:t>
+            </w:r>
+          </w:p>
+        </w:tc>
+      </w:tr>
+      <w:tr>
+        <w:tc>
+          <w:tcPr>
+            <w:tcW w:type="dxa" w:w="1600"/>
+            <w:tcBorders>
+              <w:top w:val="single" w:color="BFBFBF" w:sz="1"/>
+              <w:left w:val="single" w:color="BFBFBF" w:sz="1"/>
+              <w:bottom w:val="single" w:color="BFBFBF" w:sz="1"/>
+              <w:right w:val="single" w:color="BFBFBF" w:sz="1"/>
+            </w:tcBorders>
+            <w:shd w:fill="F2F6FA" w:val="clear"/>
+            <w:tcMar>
+              <w:top w:type="dxa" w:w="60"/>
+              <w:left w:type="dxa" w:w="120"/>
+              <w:bottom w:type="dxa" w:w="60"/>
+              <w:right w:type="dxa" w:w="120"/>
+            </w:tcMar>
+            <w:vAlign w:val="center"/>
+          </w:tcPr>
+          <w:p>
+            <w:pPr>
+              <w:spacing w:after="0" w:line="252"/>
+            </w:pPr>
+            <w:r>
+              <w:rPr>
+                <w:b w:val="false"/>
+                <w:bCs w:val="false"/>
+                <w:sz w:val="18"/>
+                <w:szCs w:val="18"/>
+              </w:rPr>
+              <w:t xml:space="preserve">Inclui</w:t>
+            </w:r>
+          </w:p>
+        </w:tc>
+        <w:tc>
+          <w:tcPr>
+            <w:tcW w:type="dxa" w:w="3680"/>
+            <w:tcBorders>
+              <w:top w:val="single" w:color="BFBFBF" w:sz="1"/>
+              <w:left w:val="single" w:color="BFBFBF" w:sz="1"/>
+              <w:bottom w:val="single" w:color="BFBFBF" w:sz="1"/>
+              <w:right w:val="single" w:color="BFBFBF" w:sz="1"/>
+            </w:tcBorders>
+            <w:shd w:fill="F2F6FA" w:val="clear"/>
+            <w:tcMar>
+              <w:top w:type="dxa" w:w="60"/>
+              <w:left w:type="dxa" w:w="120"/>
+              <w:bottom w:type="dxa" w:w="60"/>
+              <w:right w:type="dxa" w:w="120"/>
+            </w:tcMar>
+            <w:vAlign w:val="center"/>
+          </w:tcPr>
+          <w:p>
+            <w:pPr>
+              <w:spacing w:after="0" w:line="252"/>
+            </w:pPr>
+            <w:r>
+              <w:rPr>
+                <w:b w:val="false"/>
+                <w:bCs w:val="false"/>
+                <w:sz w:val="18"/>
+                <w:szCs w:val="18"/>
+              </w:rPr>
+              <w:t xml:space="preserve">Score 0–100, ranking de prioridade, alertas no WhatsApp, relatórios</w:t>
+            </w:r>
+          </w:p>
+        </w:tc>
+        <w:tc>
+          <w:tcPr>
+            <w:tcW w:type="dxa" w:w="4080"/>
+            <w:tcBorders>
+              <w:top w:val="single" w:color="BFBFBF" w:sz="1"/>
+              <w:left w:val="single" w:color="BFBFBF" w:sz="1"/>
+              <w:bottom w:val="single" w:color="BFBFBF" w:sz="1"/>
+              <w:right w:val="single" w:color="BFBFBF" w:sz="1"/>
+            </w:tcBorders>
+            <w:shd w:fill="F2F6FA" w:val="clear"/>
+            <w:tcMar>
+              <w:top w:type="dxa" w:w="60"/>
+              <w:left w:type="dxa" w:w="120"/>
+              <w:bottom w:type="dxa" w:w="60"/>
+              <w:right w:type="dxa" w:w="120"/>
+            </w:tcMar>
+            <w:vAlign w:val="center"/>
+          </w:tcPr>
+          <w:p>
+            <w:pPr>
+              <w:spacing w:after="0" w:line="252"/>
+            </w:pPr>
+            <w:r>
+              <w:rPr>
+                <w:b w:val="false"/>
+                <w:bCs w:val="false"/>
+                <w:sz w:val="18"/>
+                <w:szCs w:val="18"/>
+              </w:rPr>
+              <w:t xml:space="preserve">Tudo do Básico + Perfil do Produtor, impacto em R$, plano de ação, API, suporte prioritário</w:t>
+            </w:r>
+          </w:p>
+        </w:tc>
+      </w:tr>
+    </w:tbl>
+    <w:p>
+      <w:pPr>
+        <w:spacing w:after="120" w:before="60" w:line="276"/>
+        <w:jc w:val="left"/>
+      </w:pPr>
+      <w:r>
+        <w:t xml:space="preserve">Os R$ 30 de diferença pagam a camada de </w:t>
+      </w:r>
+      <w:r>
+        <w:rPr>
+          <w:b/>
+          <w:bCs/>
+        </w:rPr>
+        <w:t xml:space="preserve">ação</w:t>
+      </w:r>
+      <w:r>
+        <w:t xml:space="preserve"> (Perfil + plano + risco traduzido em R$) e a </w:t>
+      </w:r>
+      <w:r>
+        <w:rPr>
+          <w:b/>
+          <w:bCs/>
+        </w:rPr>
+        <w:t xml:space="preserve">integração</w:t>
+      </w:r>
+      <w:r>
+        <w:t xml:space="preserve"> (API). Preços redondos (R$ 39 / R$ 69) por ser venda B2B — passa mais seriedade que preço psicológico de varejo.</w:t>
+      </w:r>
+    </w:p>
+    <w:p>
+      <w:pPr>
+        <w:spacing w:after="120" w:before="60" w:line="276"/>
         <w:jc w:val="left"/>
       </w:pPr>
       <w:r>
@@ -9275,12 +9644,68 @@
                 <w:sz w:val="18"/>
                 <w:szCs w:val="18"/>
               </w:rPr>
-              <w:t xml:space="preserve">180+ t/ano</w:t>
+              <w:t xml:space="preserve">~180 t/ano</w:t>
             </w:r>
           </w:p>
         </w:tc>
       </w:tr>
     </w:tbl>
+    <w:p>
+      <w:pPr>
+        <w:spacing w:after="120" w:before="60" w:line="276"/>
+        <w:jc w:val="left"/>
+      </w:pPr>
+      <w:r>
+        <w:rPr>
+          <w:b/>
+          <w:bCs/>
+        </w:rPr>
+        <w:t xml:space="preserve">Memória de cálculo</w:t>
+      </w:r>
+      <w:r>
+        <w:t xml:space="preserve"> (produtor médio ~400 L/dia ≈ 12.000 L/mês; premissas a calibrar no piloto):</w:t>
+      </w:r>
+    </w:p>
+    <w:p>
+      <w:pPr>
+        <w:pStyle w:val="ListParagraph"/>
+        <w:numPr>
+          <w:ilvl w:val="0"/>
+          <w:numId w:val="2"/>
+        </w:numPr>
+        <w:spacing w:after="60" w:line="276"/>
+      </w:pPr>
+      <w:r>
+        <w:rPr>
+          <w:b/>
+          <w:bCs/>
+        </w:rPr>
+        <w:t xml:space="preserve">Ganho ~R$ 1.200/produtor/mês</w:t>
+      </w:r>
+      <w:r>
+        <w:t xml:space="preserve"> = bônus protegido R$ 0,08/L × 12.000 L = ~R$ 960 (CCS/CBT no padrão IN 77; em risco chega a R$ 1.800/mês a R$ 0,15/L — atribuímos ~metade) + descarte evitado ~4 L/dia × 30 × R$ 2,45/L (IBGE 2024) = ~R$ 294 → ≈ R$ 1.254/mês.</w:t>
+      </w:r>
+    </w:p>
+    <w:p>
+      <w:pPr>
+        <w:pStyle w:val="ListParagraph"/>
+        <w:numPr>
+          <w:ilvl w:val="0"/>
+          <w:numId w:val="2"/>
+        </w:numPr>
+        <w:spacing w:after="60" w:line="276"/>
+      </w:pPr>
+      <w:r>
+        <w:rPr>
+          <w:b/>
+          <w:bCs/>
+        </w:rPr>
+        <w:t xml:space="preserve">~180 t CO₂-eq/ano</w:t>
+      </w:r>
+      <w:r>
+        <w:t xml:space="preserve"> (coop. 50 prod.) = 50 × ~4 L/dia × 365 = ~73.000 L/ano de descarte evitado × 2,5 kg CO₂-eq/L (FAO 2010, América Latina) ≈ ~182 t/ano. Mesmos ~4 L/dia do ganho financeiro.</w:t>
+      </w:r>
+    </w:p>
     <w:p>
       <w:pPr>
         <w:spacing w:after="120" w:before="40" w:line="276"/>

</xml_diff>